<commit_message>
research: add French ministerial concept note (national CBAM-readiness programme); update call playbook
Co-authored-by: arena-agent <297053741+arena-agent@users.noreply.github.com>
</commit_message>
<xml_diff>
--- a/research/cbam_algeria/Call_Playbook_AR.docx
+++ b/research/cbam_algeria/Call_Playbook_AR.docx
@@ -896,6 +896,99 @@
         <w:t>حضّر رسالة تعريف موحدة (FR) للمنشآت ذات الأولوية A — لا تُرسلها قبل موافقة G&amp;F على المحتوى.</w:t>
       </w:r>
     </w:p>
+    <w:p>
+      <w:pPr>
+        <w:pStyle w:val="Heading1"/>
+        <w:jc w:val="right"/>
+        <w:bidi/>
+      </w:pPr>
+      <w:r>
+        <w:rPr>
+          <w:color w:val="1F3A5F"/>
+        </w:rPr>
+        <w:t>7. تحديث 21/09 — الورقة الوزارية (تُستخدم بحذر)</w:t>
+      </w:r>
+    </w:p>
+    <w:p>
+      <w:pPr>
+        <w:pStyle w:val="ListBullet"/>
+        <w:jc w:val="right"/>
+        <w:bidi/>
+      </w:pPr>
+      <w:r>
+        <w:rPr>
+          <w:b/>
+        </w:rPr>
+        <w:t xml:space="preserve">القاعدة: </w:t>
+      </w:r>
+      <w:r>
+        <w:t>لا تذكر اسم الوزير ولا الوزارة بالاسم. قل "ministerial-level access" فقط. الاسم يُكشف عند توقيع العقد.</w:t>
+      </w:r>
+    </w:p>
+    <w:p>
+      <w:pPr>
+        <w:pStyle w:val="ListBullet"/>
+        <w:jc w:val="right"/>
+        <w:bidi/>
+      </w:pPr>
+      <w:r>
+        <w:rPr>
+          <w:b/>
+        </w:rPr>
+        <w:t xml:space="preserve">الجملة (بعد عرض السوق، قبل الشروط): </w:t>
+      </w:r>
+      <w:r>
+        <w:t>"One more element, Anton. I have ministerial-level access in Algeria, and I intend to structure this as a national CBAM-readiness programme: a labelled startup vehicle, a university-hosted auditor cohort, and one accredited EU verification partner. I would like Green and Fair to be that partner. That makes this a country partnership rather than an auditor agreement — and I would like to discuss exclusivity and what you can commit on training in exchange."</w:t>
+      </w:r>
+    </w:p>
+    <w:p>
+      <w:pPr>
+        <w:pStyle w:val="ListBullet"/>
+        <w:jc w:val="right"/>
+        <w:bidi/>
+      </w:pPr>
+      <w:r>
+        <w:rPr>
+          <w:b/>
+        </w:rPr>
+        <w:t xml:space="preserve">إن سأل "ما الذي يضمنه الوصول الوزاري؟": </w:t>
+      </w:r>
+      <w:r>
+        <w:t>"A letter of support and a startup label within 30 days of your written commitment, and a ministry-sponsored national workshop in December with your expert on screen. Sequence matters: I need your letter of intent first, then I go to the ministry with a complete file."</w:t>
+      </w:r>
+    </w:p>
+    <w:p>
+      <w:pPr>
+        <w:pStyle w:val="ListBullet"/>
+        <w:jc w:val="right"/>
+        <w:bidi/>
+      </w:pPr>
+      <w:r>
+        <w:rPr>
+          <w:b/>
+        </w:rPr>
+        <w:t xml:space="preserve">ما تطلبه مقابل الحصرية: </w:t>
+      </w:r>
+      <w:r>
+        <w:t>تدريب مجاني لأول دفعة (12–15 مدققاً)، مشاركة خبيرهم في الورشة، نسبة إحالة 15%، وأجر مدقق لا يقل عن 250 €/يوم منذ المهمة الأولى.</w:t>
+      </w:r>
+    </w:p>
+    <w:p>
+      <w:pPr>
+        <w:pStyle w:val="ListBullet"/>
+        <w:jc w:val="right"/>
+        <w:bidi/>
+      </w:pPr>
+      <w:r>
+        <w:rPr>
+          <w:b/>
+        </w:rPr>
+        <w:t xml:space="preserve">التسلسل الملزم: </w:t>
+      </w:r>
+      <w:r>
+        <w:t>الأربعاء → رسالة نوايا مكتوبة من G&amp;F خلال 7–10 أيام → لقاء الوزير بالمذكرة الفرنسية + رسالة النوايا. لا تعكس الترتيب أبداً.</w:t>
+      </w:r>
+    </w:p>
     <w:sectPr>
       <w:pgSz w:w="12240" w:h="15840"/>
       <w:pgMar w:top="1020" w:right="1134" w:bottom="1020" w:left="1134" w:header="720" w:footer="720" w:gutter="0"/>

</xml_diff>